<commit_message>
docs(TASK-0001): rewrite thesis for AUN-QA Copilot (Thai format per standards), export docx + Gemini handoff
Co-Authored-By: Claude Opus 5.5 <noreply@anthropic.com>
</commit_message>
<xml_diff>
--- a/thesis/templates/reference.docx
+++ b/thesis/templates/reference.docx
@@ -317,6 +317,7 @@
       <w:footnotePr>
         <w:numRestart w:val="eachSect"/>
       </w:footnotePr>
+      <w:pgSz w:w="11909" w:h="16834"/>
       <w:pgMar w:top="2160" w:left="2160" w:bottom="1440" w:right="1440"/>
     </w:sectPr>
   </w:body>
@@ -486,7 +487,7 @@
   <w:docDefaults>
     <w:rPrDefault>
       <w:rPr>
-        <w:rFonts w:asciiTheme="minorHAnsi" w:eastAsiaTheme="minorEastAsia" w:hAnsiTheme="minorHAnsi" w:cstheme="minorBidi"/>
+        <w:rFonts w:ascii="TH Sarabun New" w:hAnsi="TH Sarabun New" w:eastAsia="TH Sarabun New" w:cs="TH Sarabun New"/>
         <w:sz w:val="24"/>
         <w:szCs w:val="24"/>
         <w:lang w:val="en-US" w:eastAsia="zh-CN" w:bidi="ar-SA"/>
@@ -502,6 +503,9 @@
   <w:style w:type="paragraph" w:default="1" w:styleId="Normal">
     <w:name w:val="Normal"/>
     <w:qFormat/>
+    <w:pPr>
+      <w:spacing w:line="240" w:lineRule="auto"/>
+    </w:pPr>
     <w:rPr>
       <w:rFonts w:ascii="TH Sarabun New" w:hAnsi="TH Sarabun New" w:eastAsia="TH Sarabun New" w:cs="TH Sarabun New"/>
       <w:sz w:val="32"/>
@@ -514,7 +518,9 @@
     <w:link w:val="BodyTextChar"/>
     <w:qFormat/>
     <w:pPr>
-      <w:spacing w:before="180" w:after="180"/>
+      <w:spacing w:before="180" w:after="180" w:line="240" w:lineRule="auto"/>
+      <w:ind w:firstLine="720"/>
+      <w:jc w:val="thaiDistribute"/>
     </w:pPr>
     <w:rPr>
       <w:rFonts w:ascii="TH Sarabun New" w:hAnsi="TH Sarabun New" w:eastAsia="TH Sarabun New" w:cs="TH Sarabun New"/>
@@ -527,6 +533,11 @@
     <w:basedOn w:val="BodyText"/>
     <w:next w:val="BodyText"/>
     <w:qFormat/>
+    <w:pPr>
+      <w:spacing w:line="240" w:lineRule="auto"/>
+      <w:ind w:firstLine="720"/>
+      <w:jc w:val="thaiDistribute"/>
+    </w:pPr>
     <w:rPr>
       <w:rFonts w:ascii="TH Sarabun New" w:hAnsi="TH Sarabun New" w:eastAsia="TH Sarabun New" w:cs="TH Sarabun New"/>
       <w:sz w:val="32"/>
@@ -538,7 +549,7 @@
     <w:basedOn w:val="BodyText"/>
     <w:qFormat/>
     <w:pPr>
-      <w:spacing w:before="36" w:after="36"/>
+      <w:spacing w:before="36" w:after="36" w:line="240" w:lineRule="auto"/>
     </w:pPr>
     <w:rPr>
       <w:rFonts w:ascii="TH Sarabun New" w:hAnsi="TH Sarabun New" w:eastAsia="TH Sarabun New" w:cs="TH Sarabun New"/>
@@ -562,6 +573,7 @@
     <w:rPr>
       <w:rFonts w:ascii="TH Sarabun New" w:hAnsi="TH Sarabun New" w:eastAsia="TH Sarabun New" w:cs="TH Sarabun New"/>
       <w:b/>
+      <w:i w:val="0"/>
       <w:sz w:val="40"/>
       <w:szCs w:val="40"/>
     </w:rPr>
@@ -590,9 +602,13 @@
       <w:numPr>
         <w:ilvl w:val="1"/>
       </w:numPr>
+      <w:spacing w:line="240" w:lineRule="auto"/>
+      <w:jc w:val="center"/>
     </w:pPr>
     <w:rPr>
       <w:rFonts w:ascii="TH Sarabun New" w:hAnsi="TH Sarabun New" w:eastAsia="TH Sarabun New" w:cs="TH Sarabun New"/>
+      <w:b/>
+      <w:i w:val="0"/>
       <w:spacing w:val="15"/>
       <w:sz w:val="36"/>
       <w:szCs w:val="36"/>
@@ -691,14 +707,17 @@
     <w:pPr>
       <w:keepNext/>
       <w:keepLines/>
-      <w:spacing w:before="360" w:after="80"/>
+      <w:pageBreakBefore/>
+      <w:spacing w:before="360" w:after="80" w:line="240" w:lineRule="auto"/>
+      <w:jc w:val="center"/>
       <w:outlineLvl w:val="0"/>
     </w:pPr>
     <w:rPr>
       <w:rFonts w:ascii="TH Sarabun New" w:hAnsi="TH Sarabun New" w:eastAsia="TH Sarabun New" w:cs="TH Sarabun New"/>
       <w:b/>
-      <w:sz w:val="40"/>
-      <w:szCs w:val="40"/>
+      <w:i w:val="0"/>
+      <w:sz w:val="36"/>
+      <w:szCs w:val="36"/>
     </w:rPr>
   </w:style>
   <w:style w:type="paragraph" w:styleId="Heading2">
@@ -714,14 +733,15 @@
     <w:pPr>
       <w:keepNext/>
       <w:keepLines/>
-      <w:spacing w:before="160" w:after="80"/>
+      <w:spacing w:before="160" w:after="80" w:line="240" w:lineRule="auto"/>
       <w:outlineLvl w:val="1"/>
     </w:pPr>
     <w:rPr>
       <w:rFonts w:ascii="TH Sarabun New" w:hAnsi="TH Sarabun New" w:eastAsia="TH Sarabun New" w:cs="TH Sarabun New"/>
       <w:b/>
-      <w:sz w:val="36"/>
-      <w:szCs w:val="36"/>
+      <w:i w:val="0"/>
+      <w:sz w:val="32"/>
+      <w:szCs w:val="32"/>
     </w:rPr>
   </w:style>
   <w:style w:type="paragraph" w:styleId="Heading3">
@@ -737,12 +757,13 @@
     <w:pPr>
       <w:keepNext/>
       <w:keepLines/>
-      <w:spacing w:before="160" w:after="80"/>
+      <w:spacing w:before="160" w:after="80" w:line="240" w:lineRule="auto"/>
       <w:outlineLvl w:val="2"/>
     </w:pPr>
     <w:rPr>
       <w:rFonts w:ascii="TH Sarabun New" w:hAnsi="TH Sarabun New" w:eastAsia="TH Sarabun New" w:cs="TH Sarabun New"/>
-      <w:b/>
+      <w:b w:val="0"/>
+      <w:i w:val="0"/>
       <w:sz w:val="32"/>
       <w:szCs w:val="32"/>
     </w:rPr>
@@ -760,13 +781,13 @@
     <w:pPr>
       <w:keepNext/>
       <w:keepLines/>
-      <w:spacing w:before="80" w:after="40"/>
+      <w:spacing w:before="80" w:after="40" w:line="240" w:lineRule="auto"/>
       <w:outlineLvl w:val="3"/>
     </w:pPr>
     <w:rPr>
       <w:rFonts w:ascii="TH Sarabun New" w:hAnsi="TH Sarabun New" w:eastAsia="TH Sarabun New" w:cs="TH Sarabun New"/>
-      <w:b/>
-      <w:i/>
+      <w:b w:val="0"/>
+      <w:i w:val="0"/>
       <w:iCs/>
       <w:sz w:val="32"/>
       <w:szCs w:val="32"/>
@@ -1008,7 +1029,7 @@
     <w:unhideWhenUsed/>
     <w:qFormat/>
     <w:pPr>
-      <w:spacing w:before="100" w:after="100"/>
+      <w:spacing w:before="100" w:after="100" w:line="240" w:lineRule="auto"/>
       <w:ind w:firstLine="0" w:left="480" w:right="480"/>
     </w:pPr>
     <w:rPr>
@@ -1086,7 +1107,8 @@
     <w:basedOn w:val="Normal"/>
     <w:link w:val="BodyTextChar"/>
     <w:pPr>
-      <w:spacing w:before="0" w:after="120"/>
+      <w:spacing w:before="0" w:after="120" w:line="240" w:lineRule="auto"/>
+      <w:jc w:val="center"/>
     </w:pPr>
     <w:rPr>
       <w:rFonts w:ascii="TH Sarabun New" w:hAnsi="TH Sarabun New" w:eastAsia="TH Sarabun New" w:cs="TH Sarabun New"/>
@@ -1100,6 +1122,8 @@
     <w:basedOn w:val="Caption"/>
     <w:pPr>
       <w:keepNext/>
+      <w:spacing w:line="240" w:lineRule="auto"/>
+      <w:jc w:val="left"/>
     </w:pPr>
     <w:rPr>
       <w:rFonts w:ascii="TH Sarabun New" w:hAnsi="TH Sarabun New" w:eastAsia="TH Sarabun New" w:cs="TH Sarabun New"/>
@@ -1110,6 +1134,10 @@
   <w:style w:type="paragraph" w:customStyle="1" w:styleId="ImageCaption">
     <w:name w:val="Image Caption"/>
     <w:basedOn w:val="Caption"/>
+    <w:pPr>
+      <w:spacing w:line="240" w:lineRule="auto"/>
+      <w:jc w:val="center"/>
+    </w:pPr>
     <w:rPr>
       <w:rFonts w:ascii="TH Sarabun New" w:hAnsi="TH Sarabun New" w:eastAsia="TH Sarabun New" w:cs="TH Sarabun New"/>
       <w:sz w:val="32"/>
@@ -1166,15 +1194,17 @@
     <w:unhideWhenUsed/>
     <w:qFormat/>
     <w:pPr>
-      <w:spacing w:before="240" w:line="259" w:lineRule="auto"/>
+      <w:spacing w:before="240" w:line="240" w:lineRule="auto"/>
+      <w:jc w:val="center"/>
       <w:outlineLvl w:val="9"/>
     </w:pPr>
     <w:rPr>
       <w:rFonts w:ascii="TH Sarabun New" w:hAnsi="TH Sarabun New" w:eastAsia="TH Sarabun New" w:cs="TH Sarabun New"/>
       <w:b/>
       <w:bCs w:val="0"/>
-      <w:sz w:val="40"/>
-      <w:szCs w:val="40"/>
+      <w:i w:val="0"/>
+      <w:sz w:val="36"/>
+      <w:szCs w:val="36"/>
     </w:rPr>
   </w:style>
 </w:styles>

</xml_diff>